<commit_message>
Updated Memoria y recogida de datos
- [Memoria] Añadida parte de la solucion distribuida
- [Python] El script de recogida de datos lo vuelca a un fichero llamado data.txt
</commit_message>
<xml_diff>
--- a/Trabajo_Kmean.docx
+++ b/Trabajo_Kmean.docx
@@ -1,6 +1,6 @@
 
 <file path=word/document.xml><?xml version="1.0" encoding="utf-8"?>
-<w:document xmlns:wpc="http://schemas.microsoft.com/office/word/2010/wordprocessingCanvas" xmlns:cx="http://schemas.microsoft.com/office/drawing/2014/chartex" xmlns:cx1="http://schemas.microsoft.com/office/drawing/2015/9/8/chartex" xmlns:cx2="http://schemas.microsoft.com/office/drawing/2015/10/21/chartex" xmlns:cx3="http://schemas.microsoft.com/office/drawing/2016/5/9/chartex" xmlns:cx4="http://schemas.microsoft.com/office/drawing/2016/5/10/chartex" xmlns:cx5="http://schemas.microsoft.com/office/drawing/2016/5/11/chartex" xmlns:cx6="http://schemas.microsoft.com/office/drawing/2016/5/12/chartex" xmlns:cx7="http://schemas.microsoft.com/office/drawing/2016/5/13/chartex" xmlns:cx8="http://schemas.microsoft.com/office/drawing/2016/5/14/chartex" xmlns:mc="http://schemas.openxmlformats.org/markup-compatibility/2006" xmlns:aink="http://schemas.microsoft.com/office/drawing/2016/ink" xmlns:am3d="http://schemas.microsoft.com/office/drawing/2017/model3d" xmlns:o="urn:schemas-microsoft-com:office:office" xmlns:r="http://schemas.openxmlformats.org/officeDocument/2006/relationships" xmlns:m="http://schemas.openxmlformats.org/officeDocument/2006/math" xmlns:v="urn:schemas-microsoft-com:vml" xmlns:wp14="http://schemas.microsoft.com/office/word/2010/wordprocessingDrawing" xmlns:wp="http://schemas.openxmlformats.org/drawingml/2006/wordprocessingDrawing" xmlns:w10="urn:schemas-microsoft-com:office:word" xmlns:w="http://schemas.openxmlformats.org/wordprocessingml/2006/main" xmlns:w14="http://schemas.microsoft.com/office/word/2010/wordml" xmlns:w15="http://schemas.microsoft.com/office/word/2012/wordml" xmlns:w16cid="http://schemas.microsoft.com/office/word/2016/wordml/cid" xmlns:w16se="http://schemas.microsoft.com/office/word/2015/wordml/symex" xmlns:wpg="http://schemas.microsoft.com/office/word/2010/wordprocessingGroup" xmlns:wpi="http://schemas.microsoft.com/office/word/2010/wordprocessingInk" xmlns:wne="http://schemas.microsoft.com/office/word/2006/wordml" xmlns:wps="http://schemas.microsoft.com/office/word/2010/wordprocessingShape" mc:Ignorable="w14 w15 w16se w16cid wp14">
+<w:document xmlns:wpc="http://schemas.microsoft.com/office/word/2010/wordprocessingCanvas" xmlns:cx="http://schemas.microsoft.com/office/drawing/2014/chartex" xmlns:mc="http://schemas.openxmlformats.org/markup-compatibility/2006" xmlns:o="urn:schemas-microsoft-com:office:office" xmlns:r="http://schemas.openxmlformats.org/officeDocument/2006/relationships" xmlns:m="http://schemas.openxmlformats.org/officeDocument/2006/math" xmlns:v="urn:schemas-microsoft-com:vml" xmlns:wp14="http://schemas.microsoft.com/office/word/2010/wordprocessingDrawing" xmlns:wp="http://schemas.openxmlformats.org/drawingml/2006/wordprocessingDrawing" xmlns:w10="urn:schemas-microsoft-com:office:word" xmlns:w="http://schemas.openxmlformats.org/wordprocessingml/2006/main" xmlns:w14="http://schemas.microsoft.com/office/word/2010/wordml" xmlns:w15="http://schemas.microsoft.com/office/word/2012/wordml" xmlns:w16se="http://schemas.microsoft.com/office/word/2015/wordml/symex" xmlns:wpg="http://schemas.microsoft.com/office/word/2010/wordprocessingGroup" xmlns:wpi="http://schemas.microsoft.com/office/word/2010/wordprocessingInk" xmlns:wne="http://schemas.microsoft.com/office/word/2006/wordml" xmlns:wps="http://schemas.microsoft.com/office/word/2010/wordprocessingShape" mc:Ignorable="w14 w15 w16se wp14">
   <w:background w:color="FFFFFF"/>
   <w:body>
     <w:p>
@@ -304,7 +304,7 @@
         <w:spacing w:before="600"/>
         <w:ind w:left="431" w:hanging="431"/>
       </w:pPr>
-      <w:bookmarkStart w:id="1" w:name="_Toc6866746"/>
+      <w:bookmarkStart w:id="1" w:name="_Toc6938618"/>
       <w:r>
         <w:lastRenderedPageBreak/>
         <w:t>Índice</w:t>
@@ -371,7 +371,7 @@
             </w:rPr>
             <w:fldChar w:fldCharType="separate"/>
           </w:r>
-          <w:hyperlink w:anchor="_Toc6866746" w:history="1">
+          <w:hyperlink w:anchor="_Toc6938618" w:history="1">
             <w:r>
               <w:rPr>
                 <w:rStyle w:val="Hipervnculo"/>
@@ -417,7 +417,7 @@
                 <w:noProof/>
                 <w:webHidden/>
               </w:rPr>
-              <w:instrText xml:space="preserve"> PAGEREF _Toc6866746 \h </w:instrText>
+              <w:instrText xml:space="preserve"> PAGEREF _Toc6938618 \h </w:instrText>
             </w:r>
             <w:r>
               <w:rPr>
@@ -461,7 +461,7 @@
               <w:szCs w:val="22"/>
             </w:rPr>
           </w:pPr>
-          <w:hyperlink w:anchor="_Toc6866747" w:history="1">
+          <w:hyperlink w:anchor="_Toc6938619" w:history="1">
             <w:r>
               <w:rPr>
                 <w:rStyle w:val="Hipervnculo"/>
@@ -507,7 +507,7 @@
                 <w:noProof/>
                 <w:webHidden/>
               </w:rPr>
-              <w:instrText xml:space="preserve"> PAGEREF _Toc6866747 \h </w:instrText>
+              <w:instrText xml:space="preserve"> PAGEREF _Toc6938619 \h </w:instrText>
             </w:r>
             <w:r>
               <w:rPr>
@@ -551,7 +551,7 @@
               <w:szCs w:val="22"/>
             </w:rPr>
           </w:pPr>
-          <w:hyperlink w:anchor="_Toc6866748" w:history="1">
+          <w:hyperlink w:anchor="_Toc6938620" w:history="1">
             <w:r>
               <w:rPr>
                 <w:rStyle w:val="Hipervnculo"/>
@@ -597,7 +597,7 @@
                 <w:noProof/>
                 <w:webHidden/>
               </w:rPr>
-              <w:instrText xml:space="preserve"> PAGEREF _Toc6866748 \h </w:instrText>
+              <w:instrText xml:space="preserve"> PAGEREF _Toc6938620 \h </w:instrText>
             </w:r>
             <w:r>
               <w:rPr>
@@ -641,7 +641,7 @@
               <w:szCs w:val="22"/>
             </w:rPr>
           </w:pPr>
-          <w:hyperlink w:anchor="_Toc6866749" w:history="1">
+          <w:hyperlink w:anchor="_Toc6938621" w:history="1">
             <w:r>
               <w:rPr>
                 <w:rStyle w:val="Hipervnculo"/>
@@ -687,7 +687,7 @@
                 <w:noProof/>
                 <w:webHidden/>
               </w:rPr>
-              <w:instrText xml:space="preserve"> PAGEREF _Toc6866749 \h </w:instrText>
+              <w:instrText xml:space="preserve"> PAGEREF _Toc6938621 \h </w:instrText>
             </w:r>
             <w:r>
               <w:rPr>
@@ -733,7 +733,7 @@
               <w:szCs w:val="22"/>
             </w:rPr>
           </w:pPr>
-          <w:hyperlink w:anchor="_Toc6866750" w:history="1">
+          <w:hyperlink w:anchor="_Toc6938622" w:history="1">
             <w:r>
               <w:rPr>
                 <w:rStyle w:val="Hipervnculo"/>
@@ -756,7 +756,7 @@
                 <w:rStyle w:val="Hipervnculo"/>
                 <w:noProof/>
               </w:rPr>
-              <w:t>Solución Kmeans no distribuido.</w:t>
+              <w:t>Solución K-means no distribuido.</w:t>
             </w:r>
             <w:r>
               <w:rPr>
@@ -777,7 +777,7 @@
                 <w:noProof/>
                 <w:webHidden/>
               </w:rPr>
-              <w:instrText xml:space="preserve"> PAGEREF _Toc6866750 \h </w:instrText>
+              <w:instrText xml:space="preserve"> PAGEREF _Toc6938622 \h </w:instrText>
             </w:r>
             <w:r>
               <w:rPr>
@@ -823,7 +823,7 @@
               <w:szCs w:val="22"/>
             </w:rPr>
           </w:pPr>
-          <w:hyperlink w:anchor="_Toc6866751" w:history="1">
+          <w:hyperlink w:anchor="_Toc6938623" w:history="1">
             <w:r>
               <w:rPr>
                 <w:rStyle w:val="Hipervnculo"/>
@@ -867,7 +867,7 @@
                 <w:noProof/>
                 <w:webHidden/>
               </w:rPr>
-              <w:instrText xml:space="preserve"> PAGEREF _Toc6866751 \h </w:instrText>
+              <w:instrText xml:space="preserve"> PAGEREF _Toc6938623 \h </w:instrText>
             </w:r>
             <w:r>
               <w:rPr>
@@ -911,7 +911,7 @@
               <w:szCs w:val="22"/>
             </w:rPr>
           </w:pPr>
-          <w:hyperlink w:anchor="_Toc6866752" w:history="1">
+          <w:hyperlink w:anchor="_Toc6938624" w:history="1">
             <w:r>
               <w:rPr>
                 <w:rStyle w:val="Hipervnculo"/>
@@ -957,7 +957,7 @@
                 <w:noProof/>
                 <w:webHidden/>
               </w:rPr>
-              <w:instrText xml:space="preserve"> PAGEREF _Toc6866752 \h </w:instrText>
+              <w:instrText xml:space="preserve"> PAGEREF _Toc6938624 \h </w:instrText>
             </w:r>
             <w:r>
               <w:rPr>
@@ -977,7 +977,7 @@
                 <w:noProof/>
                 <w:webHidden/>
               </w:rPr>
-              <w:t>7</w:t>
+              <w:t>8</w:t>
             </w:r>
             <w:r>
               <w:rPr>
@@ -1001,7 +1001,7 @@
               <w:szCs w:val="22"/>
             </w:rPr>
           </w:pPr>
-          <w:hyperlink w:anchor="_Toc6866753" w:history="1">
+          <w:hyperlink w:anchor="_Toc6938625" w:history="1">
             <w:r>
               <w:rPr>
                 <w:rStyle w:val="Hipervnculo"/>
@@ -1026,7 +1026,7 @@
                 <w:rStyle w:val="Hipervnculo"/>
                 <w:noProof/>
               </w:rPr>
-              <w:t>Anexo A: Sistema operativo, versiones y librerías utilizadas para la parte no distribuida</w:t>
+              <w:t>Anexo A: herramientas utilizadas para la solución</w:t>
             </w:r>
             <w:r>
               <w:rPr>
@@ -1047,7 +1047,7 @@
                 <w:noProof/>
                 <w:webHidden/>
               </w:rPr>
-              <w:instrText xml:space="preserve"> PAGEREF _Toc6866753 \h </w:instrText>
+              <w:instrText xml:space="preserve"> PAGEREF _Toc6938625 \h </w:instrText>
             </w:r>
             <w:r>
               <w:rPr>
@@ -1067,7 +1067,7 @@
                 <w:noProof/>
                 <w:webHidden/>
               </w:rPr>
-              <w:t>7</w:t>
+              <w:t>8</w:t>
             </w:r>
             <w:r>
               <w:rPr>
@@ -1124,7 +1124,7 @@
       <w:pPr>
         <w:pStyle w:val="Ttulo1"/>
       </w:pPr>
-      <w:bookmarkStart w:id="4" w:name="_Toc6866747"/>
+      <w:bookmarkStart w:id="4" w:name="_Toc6938619"/>
       <w:r>
         <w:lastRenderedPageBreak/>
         <w:t>Introducción</w:t>
@@ -1211,7 +1211,7 @@
           <w:b/>
           <w:i/>
         </w:rPr>
-        <w:t>Obtención y procesado de los datos.</w:t>
+        <w:t>Obtención y procesado de los datos</w:t>
       </w:r>
       <w:r>
         <w:rPr>
@@ -1326,7 +1326,7 @@
         <w:pStyle w:val="Ttulo1"/>
       </w:pPr>
       <w:bookmarkStart w:id="5" w:name="_Ref6606378"/>
-      <w:bookmarkStart w:id="6" w:name="_Toc6866748"/>
+      <w:bookmarkStart w:id="6" w:name="_Toc6938620"/>
       <w:r>
         <w:t>Obtención y procesado de los datos</w:t>
       </w:r>
@@ -1439,7 +1439,7 @@
         <w:pStyle w:val="Ttulo1"/>
       </w:pPr>
       <w:bookmarkStart w:id="7" w:name="_Ref6606442"/>
-      <w:bookmarkStart w:id="8" w:name="_Toc6866749"/>
+      <w:bookmarkStart w:id="8" w:name="_Toc6938621"/>
       <w:r>
         <w:lastRenderedPageBreak/>
         <w:t>Ejecución</w:t>
@@ -1750,22 +1750,10 @@
         <w:t xml:space="preserve"> o centroides el punto a partir del cual la disminución del error es menos pronunciada, es decir, el codo. </w:t>
       </w:r>
       <w:r>
-        <w:t xml:space="preserve">Se observa que el cambio brusco existe, pero es posible que se encuentre en varios puntos. Sin embargo, se opta por utilizar 5 </w:t>
-      </w:r>
-      <w:r>
-        <w:t>clústeres</w:t>
-      </w:r>
-      <w:r>
-        <w:t xml:space="preserve"> como valor óptimo. </w:t>
-      </w:r>
-      <w:r>
-        <w:t xml:space="preserve"> </w:t>
-      </w:r>
-      <w:r>
-        <w:rPr>
-          <w:color w:val="FF0000"/>
-        </w:rPr>
-        <w:t>(YO CREO QUE 3 TU QUE 5 Tenemos que hablarlo).</w:t>
+        <w:t>Se observa que el cambio brusco existe, pero es posible que se encuentre en varios puntos. Sin embargo, se opta por utilizar 5 clústeres como valor óptimo</w:t>
+      </w:r>
+      <w:r>
+        <w:t>.</w:t>
       </w:r>
     </w:p>
     <w:p>
@@ -1773,7 +1761,6 @@
         <w:pStyle w:val="EstiloPrimeralnea0cm"/>
       </w:pPr>
       <w:r>
-        <w:lastRenderedPageBreak/>
         <w:t xml:space="preserve">A partir de los datos obtenidos, las 20 paradas y el número de </w:t>
       </w:r>
       <w:r>
@@ -1792,7 +1779,16 @@
         </w:numPr>
       </w:pPr>
       <w:r>
-        <w:t xml:space="preserve">Sin el uso de las herramientas Docker y </w:t>
+        <w:lastRenderedPageBreak/>
+        <w:t xml:space="preserve">Sin el uso de las herramientas </w:t>
+      </w:r>
+      <w:proofErr w:type="spellStart"/>
+      <w:r>
+        <w:t>Docker</w:t>
+      </w:r>
+      <w:proofErr w:type="spellEnd"/>
+      <w:r>
+        <w:t xml:space="preserve"> y </w:t>
       </w:r>
       <w:proofErr w:type="spellStart"/>
       <w:r>
@@ -1845,6 +1841,12 @@
       </w:r>
       <w:proofErr w:type="spellEnd"/>
       <w:r>
+        <w:rPr>
+          <w:rStyle w:val="Refdenotaalpie"/>
+        </w:rPr>
+        <w:footnoteReference w:id="3"/>
+      </w:r>
+      <w:r>
         <w:t>.</w:t>
       </w:r>
     </w:p>
@@ -1852,13 +1854,16 @@
       <w:pPr>
         <w:pStyle w:val="Ttulo2"/>
       </w:pPr>
-      <w:bookmarkStart w:id="11" w:name="_Toc6866750"/>
-      <w:r>
-        <w:t xml:space="preserve">Solución </w:t>
+      <w:bookmarkStart w:id="11" w:name="_Toc6938622"/>
+      <w:r>
+        <w:t>Solución K</w:t>
+      </w:r>
+      <w:r>
+        <w:t>-</w:t>
       </w:r>
       <w:proofErr w:type="spellStart"/>
       <w:r>
-        <w:t>Kmeans</w:t>
+        <w:t>means</w:t>
       </w:r>
       <w:proofErr w:type="spellEnd"/>
       <w:r>
@@ -2012,7 +2017,7 @@
         <w:rPr>
           <w:rStyle w:val="Refdenotaalpie"/>
         </w:rPr>
-        <w:footnoteReference w:id="3"/>
+        <w:footnoteReference w:id="4"/>
       </w:r>
       <w:r>
         <w:t>.</w:t>
@@ -2104,6 +2109,9 @@
         <w:t>2</w:t>
       </w:r>
       <w:r>
+        <w:rPr>
+          <w:noProof/>
+        </w:rPr>
         <w:fldChar w:fldCharType="end"/>
       </w:r>
       <w:r>
@@ -2155,7 +2163,7 @@
         <w:rPr>
           <w:rStyle w:val="Refdenotaalpie"/>
         </w:rPr>
-        <w:footnoteReference w:id="4"/>
+        <w:footnoteReference w:id="5"/>
       </w:r>
       <w:r>
         <w:t>.</w:t>
@@ -2245,6 +2253,9 @@
         <w:t>3</w:t>
       </w:r>
       <w:r>
+        <w:rPr>
+          <w:noProof/>
+        </w:rPr>
         <w:fldChar w:fldCharType="end"/>
       </w:r>
       <w:r>
@@ -2255,7 +2266,7 @@
       <w:pPr>
         <w:pStyle w:val="Ttulo2"/>
       </w:pPr>
-      <w:bookmarkStart w:id="12" w:name="_Toc6866751"/>
+      <w:bookmarkStart w:id="12" w:name="_Toc6938623"/>
       <w:r>
         <w:t>Solución K</w:t>
       </w:r>
@@ -2292,10 +2303,18 @@
         <w:t>r</w:t>
       </w:r>
       <w:r>
-        <w:t xml:space="preserve"> contenedores Docker y </w:t>
+        <w:t xml:space="preserve"> contenedores </w:t>
       </w:r>
       <w:proofErr w:type="spellStart"/>
       <w:r>
+        <w:t>Docker</w:t>
+      </w:r>
+      <w:proofErr w:type="spellEnd"/>
+      <w:r>
+        <w:t xml:space="preserve"> y </w:t>
+      </w:r>
+      <w:proofErr w:type="spellStart"/>
+      <w:r>
         <w:t>Spark</w:t>
       </w:r>
       <w:proofErr w:type="spellEnd"/>
@@ -2376,9 +2395,6 @@
         <w:t>La ejecución del procesado de forma distribuida se realiza mediante el Script de Python [</w:t>
       </w:r>
       <w:r>
-        <w:rPr>
-          <w:color w:val="E36C0A" w:themeColor="accent6" w:themeShade="BF"/>
-        </w:rPr>
         <w:t>Kmeans.py</w:t>
       </w:r>
       <w:r>
@@ -2420,11 +2436,15 @@
         <w:fldChar w:fldCharType="separate"/>
       </w:r>
       <w:r>
+        <w:rPr>
+          <w:szCs w:val="22"/>
+        </w:rPr>
         <w:t xml:space="preserve">Figura </w:t>
       </w:r>
       <w:r>
         <w:rPr>
           <w:noProof/>
+          <w:szCs w:val="22"/>
         </w:rPr>
         <w:t>1</w:t>
       </w:r>
@@ -2523,7 +2543,25 @@
                 <w:iCs/>
                 <w:lang w:val="en-GB"/>
               </w:rPr>
-              <w:t xml:space="preserve"> docker-compose up </w:t>
+              <w:t xml:space="preserve"> </w:t>
+            </w:r>
+            <w:proofErr w:type="spellStart"/>
+            <w:r>
+              <w:rPr>
+                <w:rFonts w:ascii="Consolas" w:hAnsi="Consolas"/>
+                <w:iCs/>
+                <w:lang w:val="en-GB"/>
+              </w:rPr>
+              <w:t>docker</w:t>
+            </w:r>
+            <w:proofErr w:type="spellEnd"/>
+            <w:r>
+              <w:rPr>
+                <w:rFonts w:ascii="Consolas" w:hAnsi="Consolas"/>
+                <w:iCs/>
+                <w:lang w:val="en-GB"/>
+              </w:rPr>
+              <w:t xml:space="preserve">-compose up </w:t>
             </w:r>
           </w:p>
           <w:p>
@@ -2567,7 +2605,43 @@
                 <w:iCs/>
                 <w:lang w:val="en-GB"/>
               </w:rPr>
-              <w:t xml:space="preserve"> docker cp file “</w:t>
+              <w:t xml:space="preserve"> </w:t>
+            </w:r>
+            <w:proofErr w:type="spellStart"/>
+            <w:r>
+              <w:rPr>
+                <w:rFonts w:ascii="Consolas" w:hAnsi="Consolas"/>
+                <w:iCs/>
+                <w:lang w:val="en-GB"/>
+              </w:rPr>
+              <w:t>docker</w:t>
+            </w:r>
+            <w:proofErr w:type="spellEnd"/>
+            <w:r>
+              <w:rPr>
+                <w:rFonts w:ascii="Consolas" w:hAnsi="Consolas"/>
+                <w:iCs/>
+                <w:lang w:val="en-GB"/>
+              </w:rPr>
+              <w:t xml:space="preserve"> </w:t>
+            </w:r>
+            <w:proofErr w:type="spellStart"/>
+            <w:r>
+              <w:rPr>
+                <w:rFonts w:ascii="Consolas" w:hAnsi="Consolas"/>
+                <w:iCs/>
+                <w:lang w:val="en-GB"/>
+              </w:rPr>
+              <w:t>cp</w:t>
+            </w:r>
+            <w:proofErr w:type="spellEnd"/>
+            <w:r>
+              <w:rPr>
+                <w:rFonts w:ascii="Consolas" w:hAnsi="Consolas"/>
+                <w:iCs/>
+                <w:lang w:val="en-GB"/>
+              </w:rPr>
+              <w:t xml:space="preserve"> file “</w:t>
             </w:r>
             <w:proofErr w:type="spellStart"/>
             <w:r>
@@ -2669,7 +2743,6 @@
               </w:rPr>
               <w:t xml:space="preserve"> </w:t>
             </w:r>
-            <w:proofErr w:type="gramStart"/>
             <w:r>
               <w:rPr>
                 <w:rFonts w:ascii="Consolas" w:hAnsi="Consolas"/>
@@ -2677,17 +2750,7 @@
                 <w:iCs/>
                 <w:lang w:val="en-GB"/>
               </w:rPr>
-              <w:t>./</w:t>
-            </w:r>
-            <w:proofErr w:type="gramEnd"/>
-            <w:r>
-              <w:rPr>
-                <w:rFonts w:ascii="Consolas" w:hAnsi="Consolas"/>
-                <w:i/>
-                <w:iCs/>
-                <w:lang w:val="en-GB"/>
-              </w:rPr>
-              <w:t xml:space="preserve">bin/spark-submit --master local </w:t>
+              <w:t xml:space="preserve">./bin/spark-submit --master local </w:t>
             </w:r>
             <w:r>
               <w:rPr>
@@ -2735,10 +2798,218 @@
     </w:tbl>
     <w:p>
       <w:pPr>
+        <w:pStyle w:val="Contenido"/>
+      </w:pPr>
+    </w:p>
+    <w:p>
+      <w:pPr>
+        <w:pStyle w:val="Contenido"/>
+      </w:pPr>
+      <w:r>
+        <w:t>Para poder realizar una comparación con el algoritmo no distr</w:t>
+      </w:r>
+      <w:r>
+        <w:t>ib</w:t>
+      </w:r>
+      <w:r>
+        <w:t xml:space="preserve">uido se muestra con la librería </w:t>
+      </w:r>
+      <w:proofErr w:type="spellStart"/>
+      <w:r>
+        <w:rPr>
+          <w:i/>
+          <w:iCs/>
+        </w:rPr>
+        <w:t>matplotlib</w:t>
+      </w:r>
+      <w:proofErr w:type="spellEnd"/>
+      <w:r>
+        <w:rPr>
+          <w:i/>
+          <w:iCs/>
+        </w:rPr>
+        <w:t xml:space="preserve"> </w:t>
+      </w:r>
+      <w:r>
+        <w:rPr>
+          <w:iCs/>
+        </w:rPr>
+        <w:t>los resultados</w:t>
+      </w:r>
+    </w:p>
+    <w:p>
+      <w:pPr>
+        <w:pStyle w:val="Contenido"/>
+        <w:jc w:val="center"/>
+      </w:pPr>
+      <w:r>
+        <w:rPr>
+          <w:noProof/>
+          <w:lang w:eastAsia="es-ES" w:bidi="ar-SA"/>
+        </w:rPr>
+        <w:drawing>
+          <wp:inline distT="0" distB="0" distL="0" distR="0" wp14:anchorId="02435719" wp14:editId="0278DFEF">
+            <wp:extent cx="3916393" cy="2935709"/>
+            <wp:effectExtent l="0" t="0" r="8255" b="0"/>
+            <wp:docPr id="6" name="Imagen 6"/>
+            <wp:cNvGraphicFramePr>
+              <a:graphicFrameLocks xmlns:a="http://schemas.openxmlformats.org/drawingml/2006/main" noChangeAspect="1"/>
+            </wp:cNvGraphicFramePr>
+            <a:graphic xmlns:a="http://schemas.openxmlformats.org/drawingml/2006/main">
+              <a:graphicData uri="http://schemas.openxmlformats.org/drawingml/2006/picture">
+                <pic:pic xmlns:pic="http://schemas.openxmlformats.org/drawingml/2006/picture">
+                  <pic:nvPicPr>
+                    <pic:cNvPr id="1" name=""/>
+                    <pic:cNvPicPr/>
+                  </pic:nvPicPr>
+                  <pic:blipFill>
+                    <a:blip r:embed="rId17"/>
+                    <a:stretch>
+                      <a:fillRect/>
+                    </a:stretch>
+                  </pic:blipFill>
+                  <pic:spPr>
+                    <a:xfrm>
+                      <a:off x="0" y="0"/>
+                      <a:ext cx="3921577" cy="2939595"/>
+                    </a:xfrm>
+                    <a:prstGeom prst="rect">
+                      <a:avLst/>
+                    </a:prstGeom>
+                  </pic:spPr>
+                </pic:pic>
+              </a:graphicData>
+            </a:graphic>
+          </wp:inline>
+        </w:drawing>
+      </w:r>
+    </w:p>
+    <w:p>
+      <w:pPr>
+        <w:pStyle w:val="Descripcin"/>
+      </w:pPr>
+      <w:r>
+        <w:t xml:space="preserve">Figura </w:t>
+      </w:r>
+      <w:r>
+        <w:fldChar w:fldCharType="begin"/>
+      </w:r>
+      <w:r>
+        <w:instrText xml:space="preserve"> SEQ Figura \* ARABIC </w:instrText>
+      </w:r>
+      <w:r>
+        <w:fldChar w:fldCharType="separate"/>
+      </w:r>
+      <w:r>
+        <w:rPr>
+          <w:noProof/>
+        </w:rPr>
+        <w:t>4</w:t>
+      </w:r>
+      <w:r>
+        <w:rPr>
+          <w:noProof/>
+        </w:rPr>
+        <w:fldChar w:fldCharType="end"/>
+      </w:r>
+      <w:r>
+        <w:t>. Gráfica de las paradas agrupadas en clústeres.</w:t>
+      </w:r>
+    </w:p>
+    <w:p>
+      <w:pPr>
+        <w:pStyle w:val="Contenido"/>
+      </w:pPr>
+      <w:r>
+        <w:t>Siguiendo la teoría del apartado anterior se muestran los centroides en el mapa.</w:t>
+      </w:r>
+    </w:p>
+    <w:p>
+      <w:pPr>
+        <w:pStyle w:val="Contenido"/>
+        <w:jc w:val="center"/>
+      </w:pPr>
+      <w:r>
+        <w:rPr>
+          <w:noProof/>
+          <w:lang w:eastAsia="es-ES" w:bidi="ar-SA"/>
+        </w:rPr>
+        <w:drawing>
+          <wp:inline distT="0" distB="0" distL="0" distR="0" wp14:anchorId="4BD758D0" wp14:editId="2D61FFE9">
+            <wp:extent cx="3709358" cy="3054765"/>
+            <wp:effectExtent l="0" t="0" r="5715" b="0"/>
+            <wp:docPr id="3" name="Imagen 3"/>
+            <wp:cNvGraphicFramePr>
+              <a:graphicFrameLocks xmlns:a="http://schemas.openxmlformats.org/drawingml/2006/main" noChangeAspect="1"/>
+            </wp:cNvGraphicFramePr>
+            <a:graphic xmlns:a="http://schemas.openxmlformats.org/drawingml/2006/main">
+              <a:graphicData uri="http://schemas.openxmlformats.org/drawingml/2006/picture">
+                <pic:pic xmlns:pic="http://schemas.openxmlformats.org/drawingml/2006/picture">
+                  <pic:nvPicPr>
+                    <pic:cNvPr id="1" name=""/>
+                    <pic:cNvPicPr/>
+                  </pic:nvPicPr>
+                  <pic:blipFill>
+                    <a:blip r:embed="rId18"/>
+                    <a:stretch>
+                      <a:fillRect/>
+                    </a:stretch>
+                  </pic:blipFill>
+                  <pic:spPr>
+                    <a:xfrm>
+                      <a:off x="0" y="0"/>
+                      <a:ext cx="3724457" cy="3067200"/>
+                    </a:xfrm>
+                    <a:prstGeom prst="rect">
+                      <a:avLst/>
+                    </a:prstGeom>
+                  </pic:spPr>
+                </pic:pic>
+              </a:graphicData>
+            </a:graphic>
+          </wp:inline>
+        </w:drawing>
+      </w:r>
+    </w:p>
+    <w:p>
+      <w:pPr>
+        <w:pStyle w:val="Descripcin"/>
+      </w:pPr>
+      <w:r>
+        <w:t xml:space="preserve">Figura </w:t>
+      </w:r>
+      <w:r>
+        <w:fldChar w:fldCharType="begin"/>
+      </w:r>
+      <w:r>
+        <w:instrText xml:space="preserve"> SEQ Figura \* ARABIC </w:instrText>
+      </w:r>
+      <w:r>
+        <w:fldChar w:fldCharType="separate"/>
+      </w:r>
+      <w:r>
+        <w:rPr>
+          <w:noProof/>
+        </w:rPr>
+        <w:t>5</w:t>
+      </w:r>
+      <w:r>
+        <w:rPr>
+          <w:noProof/>
+        </w:rPr>
+        <w:fldChar w:fldCharType="end"/>
+      </w:r>
+      <w:r>
+        <w:t xml:space="preserve">. Mapa con la posición real de las paradas y los clústeres. </w:t>
+      </w:r>
+    </w:p>
+    <w:p>
+      <w:pPr>
         <w:pStyle w:val="Ttulo1"/>
       </w:pPr>
-      <w:bookmarkStart w:id="13" w:name="_Toc6866752"/>
-      <w:r>
+      <w:bookmarkStart w:id="13" w:name="_Toc6938624"/>
+      <w:r>
+        <w:lastRenderedPageBreak/>
         <w:t>Resultados</w:t>
       </w:r>
       <w:bookmarkEnd w:id="13"/>
@@ -2809,47 +3080,26 @@
     <w:p>
       <w:pPr>
         <w:pStyle w:val="EstiloPrimeralnea0cm"/>
+      </w:pPr>
+      <w:r>
+        <w:t xml:space="preserve">En cuanto a la hora de resolver la práctica utilizando Docker, te permite realizar mediante contenedores la iteración de forma distribuida. En este caso el volumen de datos es pequeño por lo que no tiene demasiada importancia la ejecución distribuida. No obstante, para volúmenes más grandes </w:t>
+      </w:r>
+      <w:r>
+        <w:t>la</w:t>
+      </w:r>
+      <w:r>
+        <w:t xml:space="preserve"> importancia de la distribución permitiría la agilización del algoritmo.</w:t>
+      </w:r>
+    </w:p>
+    <w:p>
+      <w:pPr>
+        <w:pStyle w:val="EstiloPrimeralnea0cm"/>
         <w:rPr>
           <w:color w:val="FF0000"/>
         </w:rPr>
       </w:pPr>
       <w:r>
         <w:t>Se concluye que la gran versatilidad de un lenguaje como Python para tratar retos asociados a la ciencia de los datos, tales como el tratado inicial de datos, la aplicación de algoritmos y la visualización de los resultados, se resuelven de forma alcanzable y con una curva de aprendizaje suave. Gracias a numerosas librerías, conseguir aprender a sobrepasar estos interesantes desafíos se plantea de forma sencilla y asequible.</w:t>
-      </w:r>
-    </w:p>
-    <w:p>
-      <w:pPr>
-        <w:pStyle w:val="EstiloPrimeralnea0cm"/>
-      </w:pPr>
-    </w:p>
-    <w:p>
-      <w:pPr>
-        <w:pStyle w:val="EstiloPrimeralnea0cm"/>
-      </w:pPr>
-      <w:r>
-        <w:t xml:space="preserve">Posteriormente, realizando el </w:t>
-      </w:r>
-      <w:proofErr w:type="spellStart"/>
-      <w:r>
-        <w:t>clustering</w:t>
-      </w:r>
-      <w:proofErr w:type="spellEnd"/>
-      <w:r>
-        <w:t xml:space="preserve"> utilizando el algoritmo distribuidos se obtienen las siguientes coordenadas:</w:t>
-      </w:r>
-    </w:p>
-    <w:p>
-      <w:pPr>
-        <w:pStyle w:val="EstiloPrimeralnea0cm"/>
-        <w:rPr>
-          <w:color w:val="E36C0A" w:themeColor="accent6" w:themeShade="BF"/>
-        </w:rPr>
-      </w:pPr>
-      <w:r>
-        <w:rPr>
-          <w:color w:val="E36C0A" w:themeColor="accent6" w:themeShade="BF"/>
-        </w:rPr>
-        <w:t>Aquí van mis resultados</w:t>
       </w:r>
     </w:p>
     <w:p>
@@ -2860,15 +3110,12 @@
           <w:szCs w:val="24"/>
         </w:rPr>
       </w:pPr>
-      <w:bookmarkStart w:id="14" w:name="_Toc6866753"/>
+      <w:bookmarkStart w:id="14" w:name="_Toc6938625"/>
       <w:r>
         <w:t xml:space="preserve">Anexo A: </w:t>
       </w:r>
       <w:r>
-        <w:t>Sistema operativo, versiones y librerías utilizadas</w:t>
-      </w:r>
-      <w:r>
-        <w:t xml:space="preserve"> para la parte no distribuida</w:t>
+        <w:t>herramientas utilizadas para la solución</w:t>
       </w:r>
       <w:bookmarkEnd w:id="14"/>
     </w:p>
@@ -2912,13 +3159,7 @@
         <w:ind w:hanging="357"/>
       </w:pPr>
       <w:r>
-        <w:t xml:space="preserve">La versión de </w:t>
-      </w:r>
-      <w:r>
-        <w:t>Python</w:t>
-      </w:r>
-      <w:r>
-        <w:t xml:space="preserve"> utilizada es la 3.6.5.</w:t>
+        <w:t>La versión de Python utilizada es la 3.6.5.</w:t>
       </w:r>
     </w:p>
     <w:p>
@@ -3016,12 +3257,19 @@
           <w:i/>
           <w:iCs/>
         </w:rPr>
-        <w:lastRenderedPageBreak/>
         <w:t>matplotlib</w:t>
       </w:r>
       <w:proofErr w:type="spellEnd"/>
       <w:r>
-        <w:t>: Pintar los centroides y los puntos y el método del codo en gráficas.</w:t>
+        <w:t xml:space="preserve">: Pintar los </w:t>
+      </w:r>
+      <w:proofErr w:type="spellStart"/>
+      <w:r>
+        <w:t>centroides</w:t>
+      </w:r>
+      <w:proofErr w:type="spellEnd"/>
+      <w:r>
+        <w:t xml:space="preserve"> y los puntos y el método del codo en gráficas.</w:t>
       </w:r>
     </w:p>
     <w:p>
@@ -3134,8 +3382,9 @@
         <w:t xml:space="preserve"> con el mapa y marcar la posición de los centroides y las paradas.</w:t>
       </w:r>
     </w:p>
+    <w:p/>
     <w:sectPr>
-      <w:footerReference w:type="default" r:id="rId17"/>
+      <w:footerReference w:type="default" r:id="rId19"/>
       <w:pgSz w:w="11906" w:h="16838"/>
       <w:pgMar w:top="1418" w:right="1418" w:bottom="851" w:left="1842" w:header="709" w:footer="709" w:gutter="0"/>
       <w:cols w:space="720"/>
@@ -3145,7 +3394,7 @@
 </file>
 
 <file path=word/endnotes.xml><?xml version="1.0" encoding="utf-8"?>
-<w:endnotes xmlns:wpc="http://schemas.microsoft.com/office/word/2010/wordprocessingCanvas" xmlns:cx="http://schemas.microsoft.com/office/drawing/2014/chartex" xmlns:cx1="http://schemas.microsoft.com/office/drawing/2015/9/8/chartex" xmlns:cx2="http://schemas.microsoft.com/office/drawing/2015/10/21/chartex" xmlns:cx3="http://schemas.microsoft.com/office/drawing/2016/5/9/chartex" xmlns:cx4="http://schemas.microsoft.com/office/drawing/2016/5/10/chartex" xmlns:cx5="http://schemas.microsoft.com/office/drawing/2016/5/11/chartex" xmlns:cx6="http://schemas.microsoft.com/office/drawing/2016/5/12/chartex" xmlns:cx7="http://schemas.microsoft.com/office/drawing/2016/5/13/chartex" xmlns:cx8="http://schemas.microsoft.com/office/drawing/2016/5/14/chartex" xmlns:mc="http://schemas.openxmlformats.org/markup-compatibility/2006" xmlns:aink="http://schemas.microsoft.com/office/drawing/2016/ink" xmlns:am3d="http://schemas.microsoft.com/office/drawing/2017/model3d" xmlns:o="urn:schemas-microsoft-com:office:office" xmlns:r="http://schemas.openxmlformats.org/officeDocument/2006/relationships" xmlns:m="http://schemas.openxmlformats.org/officeDocument/2006/math" xmlns:v="urn:schemas-microsoft-com:vml" xmlns:wp14="http://schemas.microsoft.com/office/word/2010/wordprocessingDrawing" xmlns:wp="http://schemas.openxmlformats.org/drawingml/2006/wordprocessingDrawing" xmlns:w10="urn:schemas-microsoft-com:office:word" xmlns:w="http://schemas.openxmlformats.org/wordprocessingml/2006/main" xmlns:w14="http://schemas.microsoft.com/office/word/2010/wordml" xmlns:w15="http://schemas.microsoft.com/office/word/2012/wordml" xmlns:w16cid="http://schemas.microsoft.com/office/word/2016/wordml/cid" xmlns:w16se="http://schemas.microsoft.com/office/word/2015/wordml/symex" xmlns:wpg="http://schemas.microsoft.com/office/word/2010/wordprocessingGroup" xmlns:wpi="http://schemas.microsoft.com/office/word/2010/wordprocessingInk" xmlns:wne="http://schemas.microsoft.com/office/word/2006/wordml" xmlns:wps="http://schemas.microsoft.com/office/word/2010/wordprocessingShape" mc:Ignorable="w14 w15 w16se w16cid wp14">
+<w:endnotes xmlns:wpc="http://schemas.microsoft.com/office/word/2010/wordprocessingCanvas" xmlns:cx="http://schemas.microsoft.com/office/drawing/2014/chartex" xmlns:mc="http://schemas.openxmlformats.org/markup-compatibility/2006" xmlns:o="urn:schemas-microsoft-com:office:office" xmlns:r="http://schemas.openxmlformats.org/officeDocument/2006/relationships" xmlns:m="http://schemas.openxmlformats.org/officeDocument/2006/math" xmlns:v="urn:schemas-microsoft-com:vml" xmlns:wp14="http://schemas.microsoft.com/office/word/2010/wordprocessingDrawing" xmlns:wp="http://schemas.openxmlformats.org/drawingml/2006/wordprocessingDrawing" xmlns:w10="urn:schemas-microsoft-com:office:word" xmlns:w="http://schemas.openxmlformats.org/wordprocessingml/2006/main" xmlns:w14="http://schemas.microsoft.com/office/word/2010/wordml" xmlns:w15="http://schemas.microsoft.com/office/word/2012/wordml" xmlns:w16se="http://schemas.microsoft.com/office/word/2015/wordml/symex" xmlns:wpg="http://schemas.microsoft.com/office/word/2010/wordprocessingGroup" xmlns:wpi="http://schemas.microsoft.com/office/word/2010/wordprocessingInk" xmlns:wne="http://schemas.microsoft.com/office/word/2006/wordml" xmlns:wps="http://schemas.microsoft.com/office/word/2010/wordprocessingShape" mc:Ignorable="w14 w15 w16se wp14">
   <w:endnote w:type="separator" w:id="-1">
     <w:p>
       <w:pPr>
@@ -3170,7 +3419,7 @@
 </file>
 
 <file path=word/footer1.xml><?xml version="1.0" encoding="utf-8"?>
-<w:ftr xmlns:wpc="http://schemas.microsoft.com/office/word/2010/wordprocessingCanvas" xmlns:cx="http://schemas.microsoft.com/office/drawing/2014/chartex" xmlns:cx1="http://schemas.microsoft.com/office/drawing/2015/9/8/chartex" xmlns:cx2="http://schemas.microsoft.com/office/drawing/2015/10/21/chartex" xmlns:cx3="http://schemas.microsoft.com/office/drawing/2016/5/9/chartex" xmlns:cx4="http://schemas.microsoft.com/office/drawing/2016/5/10/chartex" xmlns:cx5="http://schemas.microsoft.com/office/drawing/2016/5/11/chartex" xmlns:cx6="http://schemas.microsoft.com/office/drawing/2016/5/12/chartex" xmlns:cx7="http://schemas.microsoft.com/office/drawing/2016/5/13/chartex" xmlns:cx8="http://schemas.microsoft.com/office/drawing/2016/5/14/chartex" xmlns:mc="http://schemas.openxmlformats.org/markup-compatibility/2006" xmlns:aink="http://schemas.microsoft.com/office/drawing/2016/ink" xmlns:am3d="http://schemas.microsoft.com/office/drawing/2017/model3d" xmlns:o="urn:schemas-microsoft-com:office:office" xmlns:r="http://schemas.openxmlformats.org/officeDocument/2006/relationships" xmlns:m="http://schemas.openxmlformats.org/officeDocument/2006/math" xmlns:v="urn:schemas-microsoft-com:vml" xmlns:wp14="http://schemas.microsoft.com/office/word/2010/wordprocessingDrawing" xmlns:wp="http://schemas.openxmlformats.org/drawingml/2006/wordprocessingDrawing" xmlns:w10="urn:schemas-microsoft-com:office:word" xmlns:w="http://schemas.openxmlformats.org/wordprocessingml/2006/main" xmlns:w14="http://schemas.microsoft.com/office/word/2010/wordml" xmlns:w15="http://schemas.microsoft.com/office/word/2012/wordml" xmlns:w16cid="http://schemas.microsoft.com/office/word/2016/wordml/cid" xmlns:w16se="http://schemas.microsoft.com/office/word/2015/wordml/symex" xmlns:wpg="http://schemas.microsoft.com/office/word/2010/wordprocessingGroup" xmlns:wpi="http://schemas.microsoft.com/office/word/2010/wordprocessingInk" xmlns:wne="http://schemas.microsoft.com/office/word/2006/wordml" xmlns:wps="http://schemas.microsoft.com/office/word/2010/wordprocessingShape" mc:Ignorable="w14 w15 w16se w16cid wp14">
+<w:ftr xmlns:wpc="http://schemas.microsoft.com/office/word/2010/wordprocessingCanvas" xmlns:cx="http://schemas.microsoft.com/office/drawing/2014/chartex" xmlns:mc="http://schemas.openxmlformats.org/markup-compatibility/2006" xmlns:o="urn:schemas-microsoft-com:office:office" xmlns:r="http://schemas.openxmlformats.org/officeDocument/2006/relationships" xmlns:m="http://schemas.openxmlformats.org/officeDocument/2006/math" xmlns:v="urn:schemas-microsoft-com:vml" xmlns:wp14="http://schemas.microsoft.com/office/word/2010/wordprocessingDrawing" xmlns:wp="http://schemas.openxmlformats.org/drawingml/2006/wordprocessingDrawing" xmlns:w10="urn:schemas-microsoft-com:office:word" xmlns:w="http://schemas.openxmlformats.org/wordprocessingml/2006/main" xmlns:w14="http://schemas.microsoft.com/office/word/2010/wordml" xmlns:w15="http://schemas.microsoft.com/office/word/2012/wordml" xmlns:w16se="http://schemas.microsoft.com/office/word/2015/wordml/symex" xmlns:wpg="http://schemas.microsoft.com/office/word/2010/wordprocessingGroup" xmlns:wpi="http://schemas.microsoft.com/office/word/2010/wordprocessingInk" xmlns:wne="http://schemas.microsoft.com/office/word/2006/wordml" xmlns:wps="http://schemas.microsoft.com/office/word/2010/wordprocessingShape" mc:Ignorable="w14 w15 w16se wp14">
   <w:sdt>
     <w:sdtPr>
       <w:id w:val="-1560094542"/>
@@ -3179,6 +3428,7 @@
         <w:docPartUnique/>
       </w:docPartObj>
     </w:sdtPr>
+    <w:sdtEndPr/>
     <w:sdtContent>
       <w:p>
         <w:pPr>
@@ -3230,7 +3480,7 @@
 </file>
 
 <file path=word/footer2.xml><?xml version="1.0" encoding="utf-8"?>
-<w:ftr xmlns:wpc="http://schemas.microsoft.com/office/word/2010/wordprocessingCanvas" xmlns:cx="http://schemas.microsoft.com/office/drawing/2014/chartex" xmlns:cx1="http://schemas.microsoft.com/office/drawing/2015/9/8/chartex" xmlns:cx2="http://schemas.microsoft.com/office/drawing/2015/10/21/chartex" xmlns:cx3="http://schemas.microsoft.com/office/drawing/2016/5/9/chartex" xmlns:cx4="http://schemas.microsoft.com/office/drawing/2016/5/10/chartex" xmlns:cx5="http://schemas.microsoft.com/office/drawing/2016/5/11/chartex" xmlns:cx6="http://schemas.microsoft.com/office/drawing/2016/5/12/chartex" xmlns:cx7="http://schemas.microsoft.com/office/drawing/2016/5/13/chartex" xmlns:cx8="http://schemas.microsoft.com/office/drawing/2016/5/14/chartex" xmlns:mc="http://schemas.openxmlformats.org/markup-compatibility/2006" xmlns:aink="http://schemas.microsoft.com/office/drawing/2016/ink" xmlns:am3d="http://schemas.microsoft.com/office/drawing/2017/model3d" xmlns:o="urn:schemas-microsoft-com:office:office" xmlns:r="http://schemas.openxmlformats.org/officeDocument/2006/relationships" xmlns:m="http://schemas.openxmlformats.org/officeDocument/2006/math" xmlns:v="urn:schemas-microsoft-com:vml" xmlns:wp14="http://schemas.microsoft.com/office/word/2010/wordprocessingDrawing" xmlns:wp="http://schemas.openxmlformats.org/drawingml/2006/wordprocessingDrawing" xmlns:w10="urn:schemas-microsoft-com:office:word" xmlns:w="http://schemas.openxmlformats.org/wordprocessingml/2006/main" xmlns:w14="http://schemas.microsoft.com/office/word/2010/wordml" xmlns:w15="http://schemas.microsoft.com/office/word/2012/wordml" xmlns:w16cid="http://schemas.microsoft.com/office/word/2016/wordml/cid" xmlns:w16se="http://schemas.microsoft.com/office/word/2015/wordml/symex" xmlns:wpg="http://schemas.microsoft.com/office/word/2010/wordprocessingGroup" xmlns:wpi="http://schemas.microsoft.com/office/word/2010/wordprocessingInk" xmlns:wne="http://schemas.microsoft.com/office/word/2006/wordml" xmlns:wps="http://schemas.microsoft.com/office/word/2010/wordprocessingShape" mc:Ignorable="w14 w15 w16se w16cid wp14">
+<w:ftr xmlns:wpc="http://schemas.microsoft.com/office/word/2010/wordprocessingCanvas" xmlns:cx="http://schemas.microsoft.com/office/drawing/2014/chartex" xmlns:mc="http://schemas.openxmlformats.org/markup-compatibility/2006" xmlns:o="urn:schemas-microsoft-com:office:office" xmlns:r="http://schemas.openxmlformats.org/officeDocument/2006/relationships" xmlns:m="http://schemas.openxmlformats.org/officeDocument/2006/math" xmlns:v="urn:schemas-microsoft-com:vml" xmlns:wp14="http://schemas.microsoft.com/office/word/2010/wordprocessingDrawing" xmlns:wp="http://schemas.openxmlformats.org/drawingml/2006/wordprocessingDrawing" xmlns:w10="urn:schemas-microsoft-com:office:word" xmlns:w="http://schemas.openxmlformats.org/wordprocessingml/2006/main" xmlns:w14="http://schemas.microsoft.com/office/word/2010/wordml" xmlns:w15="http://schemas.microsoft.com/office/word/2012/wordml" xmlns:w16se="http://schemas.microsoft.com/office/word/2015/wordml/symex" xmlns:wpg="http://schemas.microsoft.com/office/word/2010/wordprocessingGroup" xmlns:wpi="http://schemas.microsoft.com/office/word/2010/wordprocessingInk" xmlns:wne="http://schemas.microsoft.com/office/word/2006/wordml" xmlns:wps="http://schemas.microsoft.com/office/word/2010/wordprocessingShape" mc:Ignorable="w14 w15 w16se wp14">
   <w:sdt>
     <w:sdtPr>
       <w:id w:val="-1877532861"/>
@@ -3239,6 +3489,7 @@
         <w:docPartUnique/>
       </w:docPartObj>
     </w:sdtPr>
+    <w:sdtEndPr/>
     <w:sdtContent>
       <w:p>
         <w:pPr>
@@ -3258,7 +3509,7 @@
 </file>
 
 <file path=word/footer3.xml><?xml version="1.0" encoding="utf-8"?>
-<w:ftr xmlns:wpc="http://schemas.microsoft.com/office/word/2010/wordprocessingCanvas" xmlns:cx="http://schemas.microsoft.com/office/drawing/2014/chartex" xmlns:cx1="http://schemas.microsoft.com/office/drawing/2015/9/8/chartex" xmlns:cx2="http://schemas.microsoft.com/office/drawing/2015/10/21/chartex" xmlns:cx3="http://schemas.microsoft.com/office/drawing/2016/5/9/chartex" xmlns:cx4="http://schemas.microsoft.com/office/drawing/2016/5/10/chartex" xmlns:cx5="http://schemas.microsoft.com/office/drawing/2016/5/11/chartex" xmlns:cx6="http://schemas.microsoft.com/office/drawing/2016/5/12/chartex" xmlns:cx7="http://schemas.microsoft.com/office/drawing/2016/5/13/chartex" xmlns:cx8="http://schemas.microsoft.com/office/drawing/2016/5/14/chartex" xmlns:mc="http://schemas.openxmlformats.org/markup-compatibility/2006" xmlns:aink="http://schemas.microsoft.com/office/drawing/2016/ink" xmlns:am3d="http://schemas.microsoft.com/office/drawing/2017/model3d" xmlns:o="urn:schemas-microsoft-com:office:office" xmlns:r="http://schemas.openxmlformats.org/officeDocument/2006/relationships" xmlns:m="http://schemas.openxmlformats.org/officeDocument/2006/math" xmlns:v="urn:schemas-microsoft-com:vml" xmlns:wp14="http://schemas.microsoft.com/office/word/2010/wordprocessingDrawing" xmlns:wp="http://schemas.openxmlformats.org/drawingml/2006/wordprocessingDrawing" xmlns:w10="urn:schemas-microsoft-com:office:word" xmlns:w="http://schemas.openxmlformats.org/wordprocessingml/2006/main" xmlns:w14="http://schemas.microsoft.com/office/word/2010/wordml" xmlns:w15="http://schemas.microsoft.com/office/word/2012/wordml" xmlns:w16cid="http://schemas.microsoft.com/office/word/2016/wordml/cid" xmlns:w16se="http://schemas.microsoft.com/office/word/2015/wordml/symex" xmlns:wpg="http://schemas.microsoft.com/office/word/2010/wordprocessingGroup" xmlns:wpi="http://schemas.microsoft.com/office/word/2010/wordprocessingInk" xmlns:wne="http://schemas.microsoft.com/office/word/2006/wordml" xmlns:wps="http://schemas.microsoft.com/office/word/2010/wordprocessingShape" mc:Ignorable="w14 w15 w16se w16cid wp14">
+<w:ftr xmlns:wpc="http://schemas.microsoft.com/office/word/2010/wordprocessingCanvas" xmlns:cx="http://schemas.microsoft.com/office/drawing/2014/chartex" xmlns:mc="http://schemas.openxmlformats.org/markup-compatibility/2006" xmlns:o="urn:schemas-microsoft-com:office:office" xmlns:r="http://schemas.openxmlformats.org/officeDocument/2006/relationships" xmlns:m="http://schemas.openxmlformats.org/officeDocument/2006/math" xmlns:v="urn:schemas-microsoft-com:vml" xmlns:wp14="http://schemas.microsoft.com/office/word/2010/wordprocessingDrawing" xmlns:wp="http://schemas.openxmlformats.org/drawingml/2006/wordprocessingDrawing" xmlns:w10="urn:schemas-microsoft-com:office:word" xmlns:w="http://schemas.openxmlformats.org/wordprocessingml/2006/main" xmlns:w14="http://schemas.microsoft.com/office/word/2010/wordml" xmlns:w15="http://schemas.microsoft.com/office/word/2012/wordml" xmlns:w16se="http://schemas.microsoft.com/office/word/2015/wordml/symex" xmlns:wpg="http://schemas.microsoft.com/office/word/2010/wordprocessingGroup" xmlns:wpi="http://schemas.microsoft.com/office/word/2010/wordprocessingInk" xmlns:wne="http://schemas.microsoft.com/office/word/2006/wordml" xmlns:wps="http://schemas.microsoft.com/office/word/2010/wordprocessingShape" mc:Ignorable="w14 w15 w16se wp14">
   <w:sdt>
     <w:sdtPr>
       <w:id w:val="-1278413328"/>
@@ -3267,6 +3518,7 @@
         <w:docPartUnique/>
       </w:docPartObj>
     </w:sdtPr>
+    <w:sdtEndPr/>
     <w:sdtContent>
       <w:p>
         <w:pPr>
@@ -3284,7 +3536,10 @@
           <w:fldChar w:fldCharType="separate"/>
         </w:r>
         <w:r>
-          <w:t>2</w:t>
+          <w:rPr>
+            <w:noProof/>
+          </w:rPr>
+          <w:t>1</w:t>
         </w:r>
         <w:r>
           <w:fldChar w:fldCharType="end"/>
@@ -3301,7 +3556,7 @@
 </file>
 
 <file path=word/footer4.xml><?xml version="1.0" encoding="utf-8"?>
-<w:ftr xmlns:wpc="http://schemas.microsoft.com/office/word/2010/wordprocessingCanvas" xmlns:cx="http://schemas.microsoft.com/office/drawing/2014/chartex" xmlns:cx1="http://schemas.microsoft.com/office/drawing/2015/9/8/chartex" xmlns:cx2="http://schemas.microsoft.com/office/drawing/2015/10/21/chartex" xmlns:cx3="http://schemas.microsoft.com/office/drawing/2016/5/9/chartex" xmlns:cx4="http://schemas.microsoft.com/office/drawing/2016/5/10/chartex" xmlns:cx5="http://schemas.microsoft.com/office/drawing/2016/5/11/chartex" xmlns:cx6="http://schemas.microsoft.com/office/drawing/2016/5/12/chartex" xmlns:cx7="http://schemas.microsoft.com/office/drawing/2016/5/13/chartex" xmlns:cx8="http://schemas.microsoft.com/office/drawing/2016/5/14/chartex" xmlns:mc="http://schemas.openxmlformats.org/markup-compatibility/2006" xmlns:aink="http://schemas.microsoft.com/office/drawing/2016/ink" xmlns:am3d="http://schemas.microsoft.com/office/drawing/2017/model3d" xmlns:o="urn:schemas-microsoft-com:office:office" xmlns:r="http://schemas.openxmlformats.org/officeDocument/2006/relationships" xmlns:m="http://schemas.openxmlformats.org/officeDocument/2006/math" xmlns:v="urn:schemas-microsoft-com:vml" xmlns:wp14="http://schemas.microsoft.com/office/word/2010/wordprocessingDrawing" xmlns:wp="http://schemas.openxmlformats.org/drawingml/2006/wordprocessingDrawing" xmlns:w10="urn:schemas-microsoft-com:office:word" xmlns:w="http://schemas.openxmlformats.org/wordprocessingml/2006/main" xmlns:w14="http://schemas.microsoft.com/office/word/2010/wordml" xmlns:w15="http://schemas.microsoft.com/office/word/2012/wordml" xmlns:w16cid="http://schemas.microsoft.com/office/word/2016/wordml/cid" xmlns:w16se="http://schemas.microsoft.com/office/word/2015/wordml/symex" xmlns:wpg="http://schemas.microsoft.com/office/word/2010/wordprocessingGroup" xmlns:wpi="http://schemas.microsoft.com/office/word/2010/wordprocessingInk" xmlns:wne="http://schemas.microsoft.com/office/word/2006/wordml" xmlns:wps="http://schemas.microsoft.com/office/word/2010/wordprocessingShape" mc:Ignorable="w14 w15 w16se w16cid wp14">
+<w:ftr xmlns:wpc="http://schemas.microsoft.com/office/word/2010/wordprocessingCanvas" xmlns:cx="http://schemas.microsoft.com/office/drawing/2014/chartex" xmlns:mc="http://schemas.openxmlformats.org/markup-compatibility/2006" xmlns:o="urn:schemas-microsoft-com:office:office" xmlns:r="http://schemas.openxmlformats.org/officeDocument/2006/relationships" xmlns:m="http://schemas.openxmlformats.org/officeDocument/2006/math" xmlns:v="urn:schemas-microsoft-com:vml" xmlns:wp14="http://schemas.microsoft.com/office/word/2010/wordprocessingDrawing" xmlns:wp="http://schemas.openxmlformats.org/drawingml/2006/wordprocessingDrawing" xmlns:w10="urn:schemas-microsoft-com:office:word" xmlns:w="http://schemas.openxmlformats.org/wordprocessingml/2006/main" xmlns:w14="http://schemas.microsoft.com/office/word/2010/wordml" xmlns:w15="http://schemas.microsoft.com/office/word/2012/wordml" xmlns:w16se="http://schemas.microsoft.com/office/word/2015/wordml/symex" xmlns:wpg="http://schemas.microsoft.com/office/word/2010/wordprocessingGroup" xmlns:wpi="http://schemas.microsoft.com/office/word/2010/wordprocessingInk" xmlns:wne="http://schemas.microsoft.com/office/word/2006/wordml" xmlns:wps="http://schemas.microsoft.com/office/word/2010/wordprocessingShape" mc:Ignorable="w14 w15 w16se wp14">
   <w:p>
     <w:pPr>
       <w:pStyle w:val="Piedepgina"/>
@@ -3335,7 +3590,7 @@
       <w:rPr>
         <w:noProof/>
       </w:rPr>
-      <w:t>1</w:t>
+      <w:t>8</w:t>
     </w:r>
     <w:r>
       <w:fldChar w:fldCharType="end"/>
@@ -3345,7 +3600,7 @@
 </file>
 
 <file path=word/footnotes.xml><?xml version="1.0" encoding="utf-8"?>
-<w:footnotes xmlns:wpc="http://schemas.microsoft.com/office/word/2010/wordprocessingCanvas" xmlns:cx="http://schemas.microsoft.com/office/drawing/2014/chartex" xmlns:cx1="http://schemas.microsoft.com/office/drawing/2015/9/8/chartex" xmlns:cx2="http://schemas.microsoft.com/office/drawing/2015/10/21/chartex" xmlns:cx3="http://schemas.microsoft.com/office/drawing/2016/5/9/chartex" xmlns:cx4="http://schemas.microsoft.com/office/drawing/2016/5/10/chartex" xmlns:cx5="http://schemas.microsoft.com/office/drawing/2016/5/11/chartex" xmlns:cx6="http://schemas.microsoft.com/office/drawing/2016/5/12/chartex" xmlns:cx7="http://schemas.microsoft.com/office/drawing/2016/5/13/chartex" xmlns:cx8="http://schemas.microsoft.com/office/drawing/2016/5/14/chartex" xmlns:mc="http://schemas.openxmlformats.org/markup-compatibility/2006" xmlns:aink="http://schemas.microsoft.com/office/drawing/2016/ink" xmlns:am3d="http://schemas.microsoft.com/office/drawing/2017/model3d" xmlns:o="urn:schemas-microsoft-com:office:office" xmlns:r="http://schemas.openxmlformats.org/officeDocument/2006/relationships" xmlns:m="http://schemas.openxmlformats.org/officeDocument/2006/math" xmlns:v="urn:schemas-microsoft-com:vml" xmlns:wp14="http://schemas.microsoft.com/office/word/2010/wordprocessingDrawing" xmlns:wp="http://schemas.openxmlformats.org/drawingml/2006/wordprocessingDrawing" xmlns:w10="urn:schemas-microsoft-com:office:word" xmlns:w="http://schemas.openxmlformats.org/wordprocessingml/2006/main" xmlns:w14="http://schemas.microsoft.com/office/word/2010/wordml" xmlns:w15="http://schemas.microsoft.com/office/word/2012/wordml" xmlns:w16cid="http://schemas.microsoft.com/office/word/2016/wordml/cid" xmlns:w16se="http://schemas.microsoft.com/office/word/2015/wordml/symex" xmlns:wpg="http://schemas.microsoft.com/office/word/2010/wordprocessingGroup" xmlns:wpi="http://schemas.microsoft.com/office/word/2010/wordprocessingInk" xmlns:wne="http://schemas.microsoft.com/office/word/2006/wordml" xmlns:wps="http://schemas.microsoft.com/office/word/2010/wordprocessingShape" mc:Ignorable="w14 w15 w16se w16cid wp14">
+<w:footnotes xmlns:wpc="http://schemas.microsoft.com/office/word/2010/wordprocessingCanvas" xmlns:cx="http://schemas.microsoft.com/office/drawing/2014/chartex" xmlns:mc="http://schemas.openxmlformats.org/markup-compatibility/2006" xmlns:o="urn:schemas-microsoft-com:office:office" xmlns:r="http://schemas.openxmlformats.org/officeDocument/2006/relationships" xmlns:m="http://schemas.openxmlformats.org/officeDocument/2006/math" xmlns:v="urn:schemas-microsoft-com:vml" xmlns:wp14="http://schemas.microsoft.com/office/word/2010/wordprocessingDrawing" xmlns:wp="http://schemas.openxmlformats.org/drawingml/2006/wordprocessingDrawing" xmlns:w10="urn:schemas-microsoft-com:office:word" xmlns:w="http://schemas.openxmlformats.org/wordprocessingml/2006/main" xmlns:w14="http://schemas.microsoft.com/office/word/2010/wordml" xmlns:w15="http://schemas.microsoft.com/office/word/2012/wordml" xmlns:w16se="http://schemas.microsoft.com/office/word/2015/wordml/symex" xmlns:wpg="http://schemas.microsoft.com/office/word/2010/wordprocessingGroup" xmlns:wpi="http://schemas.microsoft.com/office/word/2010/wordprocessingInk" xmlns:wne="http://schemas.microsoft.com/office/word/2006/wordml" xmlns:wps="http://schemas.microsoft.com/office/word/2010/wordprocessingShape" mc:Ignorable="w14 w15 w16se wp14">
   <w:footnote w:type="separator" w:id="-1">
     <w:p>
       <w:pPr>
@@ -3428,8 +3683,10 @@
       <w:pPr>
         <w:pStyle w:val="Estilo1"/>
         <w:rPr>
+          <w:rStyle w:val="Refdenotaalpie"/>
           <w:i/>
           <w:u w:val="single"/>
+          <w:vertAlign w:val="baseline"/>
         </w:rPr>
       </w:pPr>
       <w:r>
@@ -3439,18 +3696,51 @@
         <w:footnoteRef/>
       </w:r>
       <w:r>
+        <w:rPr>
+          <w:rStyle w:val="Refdenotaalpie"/>
+          <w:vertAlign w:val="baseline"/>
+        </w:rPr>
         <w:t xml:space="preserve"> </w:t>
       </w:r>
       <w:r>
         <w:rPr>
+          <w:rStyle w:val="Refdenotaalpie"/>
           <w:i/>
           <w:u w:val="single"/>
-        </w:rPr>
-        <w:t>https://jarroba.com/k-means-python-scikit-learn-ejemplos/</w:t>
+          <w:vertAlign w:val="baseline"/>
+        </w:rPr>
+        <w:t>https://github.com/apache/spark/blob/master/examples/src/main/python/mllib/kmeans.py</w:t>
       </w:r>
     </w:p>
   </w:footnote>
   <w:footnote w:id="4">
+    <w:p>
+      <w:pPr>
+        <w:pStyle w:val="Estilo1"/>
+        <w:rPr>
+          <w:i/>
+          <w:u w:val="single"/>
+        </w:rPr>
+      </w:pPr>
+      <w:r>
+        <w:rPr>
+          <w:rStyle w:val="Refdenotaalpie"/>
+        </w:rPr>
+        <w:footnoteRef/>
+      </w:r>
+      <w:r>
+        <w:t xml:space="preserve"> </w:t>
+      </w:r>
+      <w:r>
+        <w:rPr>
+          <w:i/>
+          <w:u w:val="single"/>
+        </w:rPr>
+        <w:t>https://jarroba.com/k-means-python-scikit-learn-ejemplos/</w:t>
+      </w:r>
+    </w:p>
+  </w:footnote>
+  <w:footnote w:id="5">
     <w:p>
       <w:pPr>
         <w:pStyle w:val="Estilo1"/>
@@ -3478,7 +3768,7 @@
 </file>
 
 <file path=word/header1.xml><?xml version="1.0" encoding="utf-8"?>
-<w:hdr xmlns:wpc="http://schemas.microsoft.com/office/word/2010/wordprocessingCanvas" xmlns:cx="http://schemas.microsoft.com/office/drawing/2014/chartex" xmlns:cx1="http://schemas.microsoft.com/office/drawing/2015/9/8/chartex" xmlns:cx2="http://schemas.microsoft.com/office/drawing/2015/10/21/chartex" xmlns:cx3="http://schemas.microsoft.com/office/drawing/2016/5/9/chartex" xmlns:cx4="http://schemas.microsoft.com/office/drawing/2016/5/10/chartex" xmlns:cx5="http://schemas.microsoft.com/office/drawing/2016/5/11/chartex" xmlns:cx6="http://schemas.microsoft.com/office/drawing/2016/5/12/chartex" xmlns:cx7="http://schemas.microsoft.com/office/drawing/2016/5/13/chartex" xmlns:cx8="http://schemas.microsoft.com/office/drawing/2016/5/14/chartex" xmlns:mc="http://schemas.openxmlformats.org/markup-compatibility/2006" xmlns:aink="http://schemas.microsoft.com/office/drawing/2016/ink" xmlns:am3d="http://schemas.microsoft.com/office/drawing/2017/model3d" xmlns:o="urn:schemas-microsoft-com:office:office" xmlns:r="http://schemas.openxmlformats.org/officeDocument/2006/relationships" xmlns:m="http://schemas.openxmlformats.org/officeDocument/2006/math" xmlns:v="urn:schemas-microsoft-com:vml" xmlns:wp14="http://schemas.microsoft.com/office/word/2010/wordprocessingDrawing" xmlns:wp="http://schemas.openxmlformats.org/drawingml/2006/wordprocessingDrawing" xmlns:w10="urn:schemas-microsoft-com:office:word" xmlns:w="http://schemas.openxmlformats.org/wordprocessingml/2006/main" xmlns:w14="http://schemas.microsoft.com/office/word/2010/wordml" xmlns:w15="http://schemas.microsoft.com/office/word/2012/wordml" xmlns:w16cid="http://schemas.microsoft.com/office/word/2016/wordml/cid" xmlns:w16se="http://schemas.microsoft.com/office/word/2015/wordml/symex" xmlns:wpg="http://schemas.microsoft.com/office/word/2010/wordprocessingGroup" xmlns:wpi="http://schemas.microsoft.com/office/word/2010/wordprocessingInk" xmlns:wne="http://schemas.microsoft.com/office/word/2006/wordml" xmlns:wps="http://schemas.microsoft.com/office/word/2010/wordprocessingShape" mc:Ignorable="w14 w15 w16se w16cid wp14">
+<w:hdr xmlns:wpc="http://schemas.microsoft.com/office/word/2010/wordprocessingCanvas" xmlns:cx="http://schemas.microsoft.com/office/drawing/2014/chartex" xmlns:mc="http://schemas.openxmlformats.org/markup-compatibility/2006" xmlns:o="urn:schemas-microsoft-com:office:office" xmlns:r="http://schemas.openxmlformats.org/officeDocument/2006/relationships" xmlns:m="http://schemas.openxmlformats.org/officeDocument/2006/math" xmlns:v="urn:schemas-microsoft-com:vml" xmlns:wp14="http://schemas.microsoft.com/office/word/2010/wordprocessingDrawing" xmlns:wp="http://schemas.openxmlformats.org/drawingml/2006/wordprocessingDrawing" xmlns:w10="urn:schemas-microsoft-com:office:word" xmlns:w="http://schemas.openxmlformats.org/wordprocessingml/2006/main" xmlns:w14="http://schemas.microsoft.com/office/word/2010/wordml" xmlns:w15="http://schemas.microsoft.com/office/word/2012/wordml" xmlns:w16se="http://schemas.microsoft.com/office/word/2015/wordml/symex" xmlns:wpg="http://schemas.microsoft.com/office/word/2010/wordprocessingGroup" xmlns:wpi="http://schemas.microsoft.com/office/word/2010/wordprocessingInk" xmlns:wne="http://schemas.microsoft.com/office/word/2006/wordml" xmlns:wps="http://schemas.microsoft.com/office/word/2010/wordprocessingShape" mc:Ignorable="w14 w15 w16se wp14">
   <w:p>
     <w:pPr>
       <w:pBdr>
@@ -3576,7 +3866,7 @@
 </file>
 
 <file path=word/header2.xml><?xml version="1.0" encoding="utf-8"?>
-<w:hdr xmlns:wpc="http://schemas.microsoft.com/office/word/2010/wordprocessingCanvas" xmlns:cx="http://schemas.microsoft.com/office/drawing/2014/chartex" xmlns:cx1="http://schemas.microsoft.com/office/drawing/2015/9/8/chartex" xmlns:cx2="http://schemas.microsoft.com/office/drawing/2015/10/21/chartex" xmlns:cx3="http://schemas.microsoft.com/office/drawing/2016/5/9/chartex" xmlns:cx4="http://schemas.microsoft.com/office/drawing/2016/5/10/chartex" xmlns:cx5="http://schemas.microsoft.com/office/drawing/2016/5/11/chartex" xmlns:cx6="http://schemas.microsoft.com/office/drawing/2016/5/12/chartex" xmlns:cx7="http://schemas.microsoft.com/office/drawing/2016/5/13/chartex" xmlns:cx8="http://schemas.microsoft.com/office/drawing/2016/5/14/chartex" xmlns:mc="http://schemas.openxmlformats.org/markup-compatibility/2006" xmlns:aink="http://schemas.microsoft.com/office/drawing/2016/ink" xmlns:am3d="http://schemas.microsoft.com/office/drawing/2017/model3d" xmlns:o="urn:schemas-microsoft-com:office:office" xmlns:r="http://schemas.openxmlformats.org/officeDocument/2006/relationships" xmlns:m="http://schemas.openxmlformats.org/officeDocument/2006/math" xmlns:v="urn:schemas-microsoft-com:vml" xmlns:wp14="http://schemas.microsoft.com/office/word/2010/wordprocessingDrawing" xmlns:wp="http://schemas.openxmlformats.org/drawingml/2006/wordprocessingDrawing" xmlns:w10="urn:schemas-microsoft-com:office:word" xmlns:w="http://schemas.openxmlformats.org/wordprocessingml/2006/main" xmlns:w14="http://schemas.microsoft.com/office/word/2010/wordml" xmlns:w15="http://schemas.microsoft.com/office/word/2012/wordml" xmlns:w16cid="http://schemas.microsoft.com/office/word/2016/wordml/cid" xmlns:w16se="http://schemas.microsoft.com/office/word/2015/wordml/symex" xmlns:wpg="http://schemas.microsoft.com/office/word/2010/wordprocessingGroup" xmlns:wpi="http://schemas.microsoft.com/office/word/2010/wordprocessingInk" xmlns:wne="http://schemas.microsoft.com/office/word/2006/wordml" xmlns:wps="http://schemas.microsoft.com/office/word/2010/wordprocessingShape" mc:Ignorable="w14 w15 w16se w16cid wp14">
+<w:hdr xmlns:wpc="http://schemas.microsoft.com/office/word/2010/wordprocessingCanvas" xmlns:cx="http://schemas.microsoft.com/office/drawing/2014/chartex" xmlns:mc="http://schemas.openxmlformats.org/markup-compatibility/2006" xmlns:o="urn:schemas-microsoft-com:office:office" xmlns:r="http://schemas.openxmlformats.org/officeDocument/2006/relationships" xmlns:m="http://schemas.openxmlformats.org/officeDocument/2006/math" xmlns:v="urn:schemas-microsoft-com:vml" xmlns:wp14="http://schemas.microsoft.com/office/word/2010/wordprocessingDrawing" xmlns:wp="http://schemas.openxmlformats.org/drawingml/2006/wordprocessingDrawing" xmlns:w10="urn:schemas-microsoft-com:office:word" xmlns:w="http://schemas.openxmlformats.org/wordprocessingml/2006/main" xmlns:w14="http://schemas.microsoft.com/office/word/2010/wordml" xmlns:w15="http://schemas.microsoft.com/office/word/2012/wordml" xmlns:w16se="http://schemas.microsoft.com/office/word/2015/wordml/symex" xmlns:wpg="http://schemas.microsoft.com/office/word/2010/wordprocessingGroup" xmlns:wpi="http://schemas.microsoft.com/office/word/2010/wordprocessingInk" xmlns:wne="http://schemas.microsoft.com/office/word/2006/wordml" xmlns:wps="http://schemas.microsoft.com/office/word/2010/wordprocessingShape" mc:Ignorable="w14 w15 w16se wp14">
   <w:p>
     <w:pPr>
       <w:pBdr>
@@ -3674,7 +3964,7 @@
 </file>
 
 <file path=word/numbering.xml><?xml version="1.0" encoding="utf-8"?>
-<w:numbering xmlns:wpc="http://schemas.microsoft.com/office/word/2010/wordprocessingCanvas" xmlns:cx="http://schemas.microsoft.com/office/drawing/2014/chartex" xmlns:cx1="http://schemas.microsoft.com/office/drawing/2015/9/8/chartex" xmlns:cx2="http://schemas.microsoft.com/office/drawing/2015/10/21/chartex" xmlns:cx3="http://schemas.microsoft.com/office/drawing/2016/5/9/chartex" xmlns:cx4="http://schemas.microsoft.com/office/drawing/2016/5/10/chartex" xmlns:cx5="http://schemas.microsoft.com/office/drawing/2016/5/11/chartex" xmlns:cx6="http://schemas.microsoft.com/office/drawing/2016/5/12/chartex" xmlns:cx7="http://schemas.microsoft.com/office/drawing/2016/5/13/chartex" xmlns:cx8="http://schemas.microsoft.com/office/drawing/2016/5/14/chartex" xmlns:mc="http://schemas.openxmlformats.org/markup-compatibility/2006" xmlns:aink="http://schemas.microsoft.com/office/drawing/2016/ink" xmlns:am3d="http://schemas.microsoft.com/office/drawing/2017/model3d" xmlns:o="urn:schemas-microsoft-com:office:office" xmlns:r="http://schemas.openxmlformats.org/officeDocument/2006/relationships" xmlns:m="http://schemas.openxmlformats.org/officeDocument/2006/math" xmlns:v="urn:schemas-microsoft-com:vml" xmlns:wp14="http://schemas.microsoft.com/office/word/2010/wordprocessingDrawing" xmlns:wp="http://schemas.openxmlformats.org/drawingml/2006/wordprocessingDrawing" xmlns:w10="urn:schemas-microsoft-com:office:word" xmlns:w="http://schemas.openxmlformats.org/wordprocessingml/2006/main" xmlns:w14="http://schemas.microsoft.com/office/word/2010/wordml" xmlns:w15="http://schemas.microsoft.com/office/word/2012/wordml" xmlns:w16cid="http://schemas.microsoft.com/office/word/2016/wordml/cid" xmlns:w16se="http://schemas.microsoft.com/office/word/2015/wordml/symex" xmlns:wpg="http://schemas.microsoft.com/office/word/2010/wordprocessingGroup" xmlns:wpi="http://schemas.microsoft.com/office/word/2010/wordprocessingInk" xmlns:wne="http://schemas.microsoft.com/office/word/2006/wordml" xmlns:wps="http://schemas.microsoft.com/office/word/2010/wordprocessingShape" mc:Ignorable="w14 w15 w16se w16cid wp14">
+<w:numbering xmlns:wpc="http://schemas.microsoft.com/office/word/2010/wordprocessingCanvas" xmlns:cx="http://schemas.microsoft.com/office/drawing/2014/chartex" xmlns:mc="http://schemas.openxmlformats.org/markup-compatibility/2006" xmlns:o="urn:schemas-microsoft-com:office:office" xmlns:r="http://schemas.openxmlformats.org/officeDocument/2006/relationships" xmlns:m="http://schemas.openxmlformats.org/officeDocument/2006/math" xmlns:v="urn:schemas-microsoft-com:vml" xmlns:wp14="http://schemas.microsoft.com/office/word/2010/wordprocessingDrawing" xmlns:wp="http://schemas.openxmlformats.org/drawingml/2006/wordprocessingDrawing" xmlns:w10="urn:schemas-microsoft-com:office:word" xmlns:w="http://schemas.openxmlformats.org/wordprocessingml/2006/main" xmlns:w14="http://schemas.microsoft.com/office/word/2010/wordml" xmlns:w15="http://schemas.microsoft.com/office/word/2012/wordml" xmlns:w16se="http://schemas.microsoft.com/office/word/2015/wordml/symex" xmlns:wpg="http://schemas.microsoft.com/office/word/2010/wordprocessingGroup" xmlns:wpi="http://schemas.microsoft.com/office/word/2010/wordprocessingInk" xmlns:wne="http://schemas.microsoft.com/office/word/2006/wordml" xmlns:wps="http://schemas.microsoft.com/office/word/2010/wordprocessingShape" mc:Ignorable="w14 w15 w16se wp14">
   <w:abstractNum w:abstractNumId="0" w15:restartNumberingAfterBreak="0">
     <w:nsid w:val="FFFFFF7C"/>
     <w:multiLevelType w:val="singleLevel"/>
@@ -7022,7 +7312,7 @@
 </file>
 
 <file path=word/styles.xml><?xml version="1.0" encoding="utf-8"?>
-<w:styles xmlns:mc="http://schemas.openxmlformats.org/markup-compatibility/2006" xmlns:r="http://schemas.openxmlformats.org/officeDocument/2006/relationships" xmlns:w="http://schemas.openxmlformats.org/wordprocessingml/2006/main" xmlns:w14="http://schemas.microsoft.com/office/word/2010/wordml" xmlns:w15="http://schemas.microsoft.com/office/word/2012/wordml" xmlns:w16cid="http://schemas.microsoft.com/office/word/2016/wordml/cid" xmlns:w16se="http://schemas.microsoft.com/office/word/2015/wordml/symex" mc:Ignorable="w14 w15 w16se w16cid">
+<w:styles xmlns:mc="http://schemas.openxmlformats.org/markup-compatibility/2006" xmlns:r="http://schemas.openxmlformats.org/officeDocument/2006/relationships" xmlns:w="http://schemas.openxmlformats.org/wordprocessingml/2006/main" xmlns:w14="http://schemas.microsoft.com/office/word/2010/wordml" xmlns:w15="http://schemas.microsoft.com/office/word/2012/wordml" xmlns:w16se="http://schemas.microsoft.com/office/word/2015/wordml/symex" mc:Ignorable="w14 w15 w16se">
   <w:docDefaults>
     <w:rPrDefault>
       <w:rPr>
@@ -7039,7 +7329,7 @@
       </w:pPr>
     </w:pPrDefault>
   </w:docDefaults>
-  <w:latentStyles w:defLockedState="0" w:defUIPriority="99" w:defSemiHidden="0" w:defUnhideWhenUsed="0" w:defQFormat="0" w:count="376">
+  <w:latentStyles w:defLockedState="0" w:defUIPriority="99" w:defSemiHidden="0" w:defUnhideWhenUsed="0" w:defQFormat="0" w:count="371">
     <w:lsdException w:name="Normal" w:uiPriority="0" w:qFormat="1"/>
     <w:lsdException w:name="heading 1" w:uiPriority="9" w:qFormat="1"/>
     <w:lsdException w:name="heading 2" w:semiHidden="1" w:uiPriority="9" w:unhideWhenUsed="1" w:qFormat="1"/>
@@ -7411,11 +7701,6 @@
     <w:lsdException w:name="List Table 5 Dark Accent 6" w:uiPriority="50"/>
     <w:lsdException w:name="List Table 6 Colorful Accent 6" w:uiPriority="51"/>
     <w:lsdException w:name="List Table 7 Colorful Accent 6" w:uiPriority="52"/>
-    <w:lsdException w:name="Mention" w:semiHidden="1" w:unhideWhenUsed="1"/>
-    <w:lsdException w:name="Smart Hyperlink" w:semiHidden="1" w:unhideWhenUsed="1"/>
-    <w:lsdException w:name="Hashtag" w:semiHidden="1" w:unhideWhenUsed="1"/>
-    <w:lsdException w:name="Unresolved Mention" w:semiHidden="1" w:unhideWhenUsed="1"/>
-    <w:lsdException w:name="Smart Link" w:semiHidden="1" w:unhideWhenUsed="1"/>
   </w:latentStyles>
   <w:style w:type="paragraph" w:default="1" w:styleId="Normal">
     <w:name w:val="Normal"/>
@@ -7734,7 +8019,7 @@
       <w:u w:val="single"/>
     </w:rPr>
   </w:style>
-  <w:style w:type="character" w:styleId="Mencinsinresolver">
+  <w:style w:type="character" w:customStyle="1" w:styleId="UnresolvedMention">
     <w:name w:val="Unresolved Mention"/>
     <w:basedOn w:val="Fuentedeprrafopredeter"/>
     <w:uiPriority w:val="99"/>
@@ -8561,7 +8846,7 @@
 </file>
 
 <file path=customXml/itemProps1.xml><?xml version="1.0" encoding="utf-8"?>
-<ds:datastoreItem xmlns:ds="http://schemas.openxmlformats.org/officeDocument/2006/customXml" ds:itemID="{B0094AE7-15E8-4192-B240-5A6D8C59A5E9}">
+<ds:datastoreItem xmlns:ds="http://schemas.openxmlformats.org/officeDocument/2006/customXml" ds:itemID="{0750D8F6-30AB-4DDE-8CFF-DA6E54692DC8}">
   <ds:schemaRefs>
     <ds:schemaRef ds:uri="http://schemas.openxmlformats.org/officeDocument/2006/bibliography"/>
   </ds:schemaRefs>

</xml_diff>